<commit_message>
feat: initialize full-stack AI governance platform with authentication, LLM services, websocket management, and localized frontend UI.
</commit_message>
<xml_diff>
--- a/docs/threshold-ai-governance_Architecture.docx
+++ b/docs/threshold-ai-governance_Architecture.docx
@@ -15,7 +15,7 @@
           <w:sz w:val="64"/>
           <w:szCs w:val="64"/>
         </w:rPr>
-        <w:t xml:space="preserve">SENTINEL</w:t>
+        <w:t>THRESHOLD</w:t>
       </w:r>
     </w:p>
     <w:p>
@@ -147,7 +147,7 @@
           <w:sz w:val="22"/>
           <w:szCs w:val="22"/>
         </w:rPr>
-        <w:t xml:space="preserve">Sentinel is an enterprise AI Governance Platform that lets employees interact with an AI assistant to manage company resources through natural language. Every action the assistant proposes is routed through a Governance Layer before execution, so autonomy is graduated rather than absolute — low-risk actions execute automatically, medium-risk actions require user confirmation, and high-risk actions are escalated to human review.</w:t>
+        <w:t>Threshold is an enterprise AI Governance Platform that lets employees interact with an AI assistant to manage company resources through natural language. Every action the assistant proposes is routed through a Governance Layer before execution, so autonomy is graduated rather than absolute — low-risk actions execute automatically, medium-risk actions require user confirmation, and high-risk actions are escalated to human review.</w:t>
       </w:r>
     </w:p>
     <w:p>
@@ -4484,7 +4484,7 @@
         <w:sz w:val="16"/>
         <w:szCs w:val="16"/>
       </w:rPr>
-      <w:t xml:space="preserve">Sentinel AI Governance Platform — Architecture &amp; Specification</w:t>
+      <w:t>Threshold AI Governance Platform — Architecture &amp; Specification</w:t>
     </w:r>
   </w:p>
 </w:hdr>

</xml_diff>